<commit_message>
Projekt strony v2 (PROJEKT-STRONY.md), poprawki opracowania, stan prac
Co-Authored-By: Claude Opus 5.5 <noreply@anthropic.com>
</commit_message>
<xml_diff>
--- a/Opracowanie/Historia rodziny Boxa-Radoszewskich.docx
+++ b/Opracowanie/Historia rodziny Boxa-Radoszewskich.docx
@@ -1670,7 +1670,7 @@
       </w:pPr>
       <w:r>
         <w:rPr/>
-        <w:t>4. Wiek XVI: Mikołaj Węgierski i jego bracia</w:t>
+        <w:t>4. Wiek XVI: Mikołaj Boksa i jego bracia</w:t>
       </w:r>
     </w:p>
     <w:p>
@@ -1858,7 +1858,17 @@
       </w:r>
       <w:r>
         <w:rPr/>
-        <w:t xml:space="preserve"> Urodziłby się więc około 1489 roku, a to zgadza się ze służbą na Węgrzech przed 1526 rokiem. Jako żonę zeszyt wymienia jednak </w:t>
+        <w:t xml:space="preserve"> Urodziłby się więc około 1489 roku, a to zgadza się ze służbą na Węgrzech przed 1526 rokiem. Nie zgadza się natomiast z datą śmierci jego ojca: Bogusław zmarł według zeszytu w 1459 roku, trzydzieści lat przed urodzeniem Mikołaja. </w:t>
+      </w:r>
+      <w:r>
+        <w:rPr>
+          <w:i/>
+        </w:rPr>
+        <w:t>Uwaga opracowującego:</w:t>
+      </w:r>
+      <w:r>
+        <w:rPr/>
+        <w:t xml:space="preserve"> między Bogusławem a Mikołajem, który walczył na Węgrzech, zapewne brakuje w drzewie co najmniej jednego pokolenia. Drzewo z XVII wieku mogło je pominąć albo połączyć dwie osoby o tym samym imieniu. Jako żonę zeszyt wymienia jednak </w:t>
       </w:r>
       <w:r>
         <w:rPr>
@@ -9876,6 +9886,22 @@
       <w:r>
         <w:rPr/>
         <w:t>Najważniejsze sprawy, których źródła nie rozstrzygają. Mogą je wyjaśnić rodzina albo dalsze poszukiwania:</w:t>
+      </w:r>
+    </w:p>
+    <w:p>
+      <w:pPr>
+        <w:pStyle w:val="ListNumber"/>
+        <w:spacing w:after="60"/>
+      </w:pPr>
+      <w:r>
+        <w:rPr>
+          <w:b/>
+        </w:rPr>
+        <w:t>Luka w drzewie w XV–XVI wieku:</w:t>
+      </w:r>
+      <w:r>
+        <w:rPr/>
+        <w:t xml:space="preserve"> Bogusław z Radoszewic zmarł w 1459 roku, a Mikołaj, uważany za jego syna, urodził się ok. 1489 roku. Zapewne brakuje co najmniej jednego pokolenia (rozdz. 4).</w:t>
       </w:r>
     </w:p>
     <w:p>

</xml_diff>